<commit_message>
Generate diagrams dynamically with LLM
</commit_message>
<xml_diff>
--- a/templates/投标方案模板.docx
+++ b/templates/投标方案模板.docx
@@ -20,14 +20,6 @@
         <w:gridCol w:w="8145"/>
       </w:tblGrid>
       <w:tr>
-        <w:tblPrEx>
-          <w:tblCellMar>
-            <w:top w:w="0" w:type="dxa"/>
-            <w:left w:w="0" w:type="dxa"/>
-            <w:bottom w:w="0" w:type="dxa"/>
-            <w:right w:w="0" w:type="dxa"/>
-          </w:tblCellMar>
-        </w:tblPrEx>
         <w:trPr>
           <w:cantSplit/>
         </w:trPr>
@@ -177,8 +169,6 @@
           <w:docGrid w:type="linesAndChars" w:linePitch="381" w:charSpace="2867"/>
         </w:sectPr>
       </w:pPr>
-      <w:bookmarkStart w:id="71" w:name="_GoBack"/>
-      <w:bookmarkEnd w:id="71"/>
       <w:r>
         <w:rPr>
           <w:sz w:val="28"/>
@@ -545,8 +535,8 @@
                               </w:rPr>
                               <w:t xml:space="preserve">   </w:t>
                             </w:r>
-                            <w:bookmarkStart w:id="70" w:name="sig_VERSION"/>
-                            <w:bookmarkEnd w:id="70"/>
+                            <w:bookmarkStart w:id="42" w:name="sig_VERSION"/>
+                            <w:bookmarkEnd w:id="42"/>
                             <w:r>
                               <w:rPr>
                                 <w:rFonts w:hint="eastAsia" w:ascii="宋体" w:hAnsi="宋体"/>
@@ -747,8 +737,8 @@
                         </w:rPr>
                         <w:t xml:space="preserve">   </w:t>
                       </w:r>
-                      <w:bookmarkStart w:id="70" w:name="sig_VERSION"/>
-                      <w:bookmarkEnd w:id="70"/>
+                      <w:bookmarkStart w:id="42" w:name="sig_VERSION"/>
+                      <w:bookmarkEnd w:id="42"/>
                       <w:r>
                         <w:rPr>
                           <w:rFonts w:hint="eastAsia" w:ascii="宋体" w:hAnsi="宋体"/>
@@ -1678,26 +1668,6 @@
         </w:rPr>
         <w:t>【GEN:编写目的】</w:t>
       </w:r>
-      <w:r>
-        <w:rPr>
-          <w:rFonts w:hint="eastAsia" w:ascii="Times New Roman" w:hAnsi="Times New Roman" w:eastAsia="宋体" w:cs="Times New Roman"/>
-          <w:kern w:val="2"/>
-          <w:sz w:val="24"/>
-          <w:szCs w:val="24"/>
-          <w:lang w:val="en-US" w:eastAsia="zh-CN" w:bidi="ar-SA"/>
-          <w14:ligatures w14:val="standardContextual"/>
-        </w:rPr>
-      </w:r>
-      <w:r>
-        <w:rPr>
-          <w:rFonts w:hint="default" w:ascii="Times New Roman" w:hAnsi="Times New Roman" w:eastAsia="宋体" w:cs="Times New Roman"/>
-          <w:kern w:val="2"/>
-          <w:sz w:val="24"/>
-          <w:szCs w:val="24"/>
-          <w:lang w:val="en-US" w:eastAsia="zh-CN" w:bidi="ar-SA"/>
-          <w14:ligatures w14:val="standardContextual"/>
-        </w:rPr>
-      </w:r>
     </w:p>
     <w:p>
       <w:pPr>
@@ -1720,8 +1690,8 @@
         </w:rPr>
       </w:pPr>
       <w:bookmarkStart w:id="4" w:name="_Toc18778"/>
-      <w:bookmarkStart w:id="5" w:name="_Ref8741"/>
-      <w:bookmarkStart w:id="6" w:name="_Toc22801"/>
+      <w:bookmarkStart w:id="5" w:name="_Toc22801"/>
+      <w:bookmarkStart w:id="6" w:name="_Ref8741"/>
       <w:r>
         <w:rPr>
           <w:rFonts w:hint="eastAsia" w:ascii="黑体" w:hAnsi="黑体" w:eastAsia="黑体" w:cs="黑体"/>
@@ -1761,26 +1731,6 @@
         </w:rPr>
         <w:t>【GEN:建设内容】</w:t>
       </w:r>
-      <w:r>
-        <w:rPr>
-          <w:rFonts w:hint="eastAsia" w:ascii="Times New Roman" w:hAnsi="Times New Roman" w:eastAsia="宋体" w:cs="Times New Roman"/>
-          <w:kern w:val="2"/>
-          <w:sz w:val="24"/>
-          <w:szCs w:val="24"/>
-          <w:lang w:val="en-US" w:eastAsia="zh-CN" w:bidi="ar-SA"/>
-          <w14:ligatures w14:val="standardContextual"/>
-        </w:rPr>
-      </w:r>
-      <w:r>
-        <w:rPr>
-          <w:rFonts w:hint="default" w:ascii="Times New Roman" w:hAnsi="Times New Roman" w:eastAsia="宋体" w:cs="Times New Roman"/>
-          <w:kern w:val="2"/>
-          <w:sz w:val="24"/>
-          <w:szCs w:val="24"/>
-          <w:lang w:val="en-US" w:eastAsia="zh-CN" w:bidi="ar-SA"/>
-          <w14:ligatures w14:val="standardContextual"/>
-        </w:rPr>
-      </w:r>
     </w:p>
     <w:p>
       <w:pPr>
@@ -1802,10 +1752,10 @@
           <w:lang w:val="en-US" w:eastAsia="zh-CN"/>
         </w:rPr>
       </w:pPr>
-      <w:bookmarkStart w:id="7" w:name="_Toc13326"/>
-      <w:bookmarkStart w:id="8" w:name="_Ref3127"/>
+      <w:bookmarkStart w:id="7" w:name="_Toc2684"/>
+      <w:bookmarkStart w:id="8" w:name="_Toc13326"/>
       <w:bookmarkStart w:id="9" w:name="_Ref1416"/>
-      <w:bookmarkStart w:id="10" w:name="_Toc2684"/>
+      <w:bookmarkStart w:id="10" w:name="_Ref3127"/>
       <w:r>
         <w:rPr>
           <w:rFonts w:hint="eastAsia" w:ascii="黑体" w:hAnsi="黑体" w:eastAsia="黑体" w:cs="黑体"/>
@@ -9766,18 +9716,6 @@
         </w:rPr>
         <w:t>【COPY:技术要求-通用质量特性要求】</w:t>
       </w:r>
-      <w:r>
-        <w:rPr>
-          <w:rFonts w:hint="eastAsia"/>
-          <w:lang w:val="en-US" w:eastAsia="zh-CN"/>
-        </w:rPr>
-      </w:r>
-      <w:r>
-        <w:rPr>
-          <w:rFonts w:hint="eastAsia" w:ascii="Times New Roman" w:eastAsia="宋体"/>
-          <w:lang w:val="en-US" w:eastAsia="zh-CN"/>
-        </w:rPr>
-      </w:r>
     </w:p>
     <w:p>
       <w:pPr>
@@ -9883,6 +9821,7 @@
     <w:p>
       <w:pPr>
         <w:numPr>
+          <w:ilvl w:val="0"/>
           <w:numId w:val="0"/>
         </w:numPr>
         <w:adjustRightInd w:val="0"/>
@@ -9899,20 +9838,6 @@
           <w:lang w:val="en-US" w:eastAsia="zh-CN"/>
         </w:rPr>
         <w:t>【GEN:总体架构设计】</w:t>
-      </w:r>
-      <w:r>
-        <w:rPr>
-          <w:rFonts w:hint="eastAsia"/>
-          <w:szCs w:val="28"/>
-          <w:lang w:val="en-US" w:eastAsia="zh-CN"/>
-        </w:rPr>
-      </w:r>
-      <w:r>
-        <w:rPr>
-          <w:rFonts w:hint="default"/>
-          <w:szCs w:val="28"/>
-          <w:lang w:val="en-US" w:eastAsia="zh-CN"/>
-        </w:rPr>
       </w:r>
     </w:p>
     <w:p>
@@ -10126,6 +10051,7 @@
       <w:pPr>
         <w:pStyle w:val="3"/>
         <w:numPr>
+          <w:ilvl w:val="0"/>
           <w:numId w:val="0"/>
         </w:numPr>
         <w:bidi w:val="0"/>
@@ -10142,17 +10068,12 @@
         </w:rPr>
         <w:t>【GEN:功能设计总述】</w:t>
       </w:r>
-      <w:r>
-        <w:rPr>
-          <w:rFonts w:hint="eastAsia"/>
-          <w:lang w:val="en-US" w:eastAsia="zh-CN"/>
-        </w:rPr>
-      </w:r>
     </w:p>
     <w:p>
       <w:pPr>
         <w:pStyle w:val="3"/>
         <w:numPr>
+          <w:ilvl w:val="0"/>
           <w:numId w:val="0"/>
         </w:numPr>
         <w:bidi w:val="0"/>
@@ -10168,12 +10089,6 @@
           <w:lang w:val="en-US" w:eastAsia="zh-CN"/>
         </w:rPr>
         <w:t>【GEN:功能设计章节】</w:t>
-      </w:r>
-      <w:r>
-        <w:rPr>
-          <w:rFonts w:hint="eastAsia"/>
-          <w:lang w:eastAsia="zh-CN"/>
-        </w:rPr>
       </w:r>
     </w:p>
     <w:p>
@@ -10227,18 +10142,6 @@
           <w:lang w:eastAsia="zh-CN"/>
         </w:rPr>
         <w:t>【GEN:性能设计章节】</w:t>
-      </w:r>
-      <w:r>
-        <w:rPr>
-          <w:rFonts w:hint="eastAsia"/>
-          <w:lang w:val="en-US" w:eastAsia="zh-CN"/>
-        </w:rPr>
-      </w:r>
-      <w:r>
-        <w:rPr>
-          <w:rFonts w:hint="eastAsia"/>
-          <w:lang w:eastAsia="zh-CN"/>
-        </w:rPr>
       </w:r>
     </w:p>
     <w:p>
@@ -10301,18 +10204,6 @@
           <w:lang w:eastAsia="zh-CN"/>
         </w:rPr>
         <w:t>【GEN:数据库设计总述】</w:t>
-      </w:r>
-      <w:r>
-        <w:rPr>
-          <w:rFonts w:hint="eastAsia"/>
-          <w:lang w:val="en-US" w:eastAsia="zh-CN"/>
-        </w:rPr>
-      </w:r>
-      <w:r>
-        <w:rPr>
-          <w:rFonts w:hint="eastAsia"/>
-          <w:lang w:eastAsia="zh-CN"/>
-        </w:rPr>
       </w:r>
     </w:p>
     <w:p>
@@ -10477,8 +10368,8 @@
         </w:rPr>
       </w:pPr>
       <w:bookmarkStart w:id="17" w:name="_Toc1932"/>
-      <w:bookmarkStart w:id="18" w:name="_Toc11462"/>
-      <w:bookmarkStart w:id="19" w:name="_Toc9876"/>
+      <w:bookmarkStart w:id="18" w:name="_Toc9876"/>
+      <w:bookmarkStart w:id="19" w:name="_Toc11462"/>
       <w:r>
         <w:rPr>
           <w:rFonts w:hint="eastAsia" w:ascii="黑体" w:hAnsi="黑体" w:eastAsia="黑体" w:cs="黑体"/>
@@ -10491,17 +10382,16 @@
       <w:bookmarkEnd w:id="17"/>
     </w:p>
     <w:p>
-      <w:pPr/>
+      <w:pPr>
+        <w:widowControl w:val="0"/>
+        <w:bidi w:val="0"/>
+        <w:spacing w:after="2" w:line="360" w:lineRule="auto"/>
+        <w:ind w:firstLine="480" w:firstLineChars="200"/>
+      </w:pPr>
       <w:r>
         <w:t>【GEN:通用质量特性设计总述】</w:t>
       </w:r>
     </w:p>
-    <CT_P>
-      <w:pPr/>
-      <w:r>
-        <w:t>【GEN:通用质量特性设计总述】</w:t>
-      </w:r>
-    </CT_P>
     <w:p>
       <w:pPr>
         <w:keepNext/>
@@ -10890,17 +10780,18 @@
       <w:bookmarkEnd w:id="27"/>
     </w:p>
     <w:p>
-      <w:pPr/>
+      <w:pPr>
+        <w:widowControl w:val="0"/>
+        <w:bidi w:val="0"/>
+        <w:spacing w:after="2" w:line="360" w:lineRule="auto"/>
+        <w:ind w:firstLine="480" w:firstLineChars="200"/>
+      </w:pPr>
+      <w:bookmarkStart w:id="43" w:name="_GoBack"/>
       <w:r>
         <w:t>【GEN:质量控制总述】</w:t>
       </w:r>
     </w:p>
-    <CT_P>
-      <w:pPr/>
-      <w:r>
-        <w:t>【GEN:质量控制总述】</w:t>
-      </w:r>
-    </CT_P>
+    <w:bookmarkEnd w:id="43"/>
     <w:p>
       <w:pPr>
         <w:keepNext/>
@@ -10974,8 +10865,8 @@
           <w:lang w:val="en-US" w:eastAsia="zh-CN"/>
         </w:rPr>
       </w:pPr>
-      <w:bookmarkStart w:id="29" w:name="_Toc26513"/>
-      <w:bookmarkStart w:id="30" w:name="_Toc19435"/>
+      <w:bookmarkStart w:id="29" w:name="_Toc19435"/>
+      <w:bookmarkStart w:id="30" w:name="_Toc26513"/>
       <w:r>
         <w:rPr>
           <w:rFonts w:hint="eastAsia" w:ascii="黑体" w:hAnsi="黑体" w:eastAsia="黑体" w:cs="黑体"/>
@@ -13862,9 +13753,9 @@
           <w:lang w:val="en-US" w:eastAsia="zh-CN"/>
         </w:rPr>
       </w:pPr>
-      <w:bookmarkStart w:id="32" w:name="_Ref3150"/>
-      <w:bookmarkStart w:id="33" w:name="_Toc18355"/>
-      <w:bookmarkStart w:id="34" w:name="_Toc24827"/>
+      <w:bookmarkStart w:id="31" w:name="_Ref3150"/>
+      <w:bookmarkStart w:id="32" w:name="_Toc18355"/>
+      <w:bookmarkStart w:id="33" w:name="_Toc24827"/>
       <w:r>
         <w:rPr>
           <w:rFonts w:hint="eastAsia" w:ascii="黑体" w:hAnsi="黑体" w:eastAsia="黑体" w:cs="黑体"/>
@@ -13874,9 +13765,9 @@
         </w:rPr>
         <w:t>项目进度计划</w:t>
       </w:r>
+      <w:bookmarkEnd w:id="31"/>
       <w:bookmarkEnd w:id="32"/>
       <w:bookmarkEnd w:id="33"/>
-      <w:bookmarkEnd w:id="34"/>
     </w:p>
     <w:p>
       <w:pPr>
@@ -13926,9 +13817,9 @@
           <w:lang w:val="en-US" w:eastAsia="zh-CN"/>
         </w:rPr>
       </w:pPr>
-      <w:bookmarkStart w:id="35" w:name="_Ref881"/>
-      <w:bookmarkStart w:id="36" w:name="_Toc24805"/>
-      <w:bookmarkStart w:id="37" w:name="_Toc30998"/>
+      <w:bookmarkStart w:id="34" w:name="_Ref881"/>
+      <w:bookmarkStart w:id="35" w:name="_Toc24805"/>
+      <w:bookmarkStart w:id="36" w:name="_Toc30998"/>
       <w:r>
         <w:rPr>
           <w:rFonts w:hint="eastAsia" w:ascii="黑体" w:hAnsi="黑体" w:eastAsia="黑体" w:cs="黑体"/>
@@ -13938,9 +13829,9 @@
         </w:rPr>
         <w:t>项目人员组成</w:t>
       </w:r>
+      <w:bookmarkEnd w:id="34"/>
       <w:bookmarkEnd w:id="35"/>
       <w:bookmarkEnd w:id="36"/>
-      <w:bookmarkEnd w:id="37"/>
     </w:p>
     <w:p>
       <w:pPr>
@@ -15769,8 +15660,8 @@
           <w:lang w:val="en-US" w:eastAsia="zh-CN"/>
         </w:rPr>
       </w:pPr>
+      <w:bookmarkStart w:id="37" w:name="_Toc11424"/>
       <w:bookmarkStart w:id="38" w:name="_Toc10496"/>
-      <w:bookmarkStart w:id="39" w:name="_Toc11424"/>
       <w:r>
         <w:rPr>
           <w:rFonts w:hint="eastAsia" w:ascii="黑体" w:hAnsi="黑体" w:eastAsia="黑体" w:cs="黑体"/>
@@ -15780,8 +15671,8 @@
         </w:rPr>
         <w:t>成果交付及验收</w:t>
       </w:r>
+      <w:bookmarkEnd w:id="37"/>
       <w:bookmarkEnd w:id="38"/>
-      <w:bookmarkEnd w:id="39"/>
     </w:p>
     <w:p>
       <w:pPr>
@@ -16088,7 +15979,7 @@
               <w:widowControl w:val="0"/>
               <w:numPr>
                 <w:ilvl w:val="0"/>
-                <w:numId w:val="19"/>
+                <w:numId w:val="16"/>
               </w:numPr>
               <w:bidi w:val="0"/>
               <w:spacing w:after="2" w:line="360" w:lineRule="auto"/>
@@ -16270,7 +16161,7 @@
               <w:widowControl w:val="0"/>
               <w:numPr>
                 <w:ilvl w:val="0"/>
-                <w:numId w:val="19"/>
+                <w:numId w:val="16"/>
               </w:numPr>
               <w:bidi w:val="0"/>
               <w:spacing w:after="2" w:line="360" w:lineRule="auto"/>
@@ -16452,7 +16343,7 @@
               <w:widowControl w:val="0"/>
               <w:numPr>
                 <w:ilvl w:val="0"/>
-                <w:numId w:val="19"/>
+                <w:numId w:val="16"/>
               </w:numPr>
               <w:bidi w:val="0"/>
               <w:spacing w:after="2" w:line="360" w:lineRule="auto"/>
@@ -16634,7 +16525,7 @@
               <w:widowControl w:val="0"/>
               <w:numPr>
                 <w:ilvl w:val="0"/>
-                <w:numId w:val="19"/>
+                <w:numId w:val="16"/>
               </w:numPr>
               <w:bidi w:val="0"/>
               <w:spacing w:after="2" w:line="360" w:lineRule="auto"/>
@@ -16816,7 +16707,7 @@
               <w:widowControl w:val="0"/>
               <w:numPr>
                 <w:ilvl w:val="0"/>
-                <w:numId w:val="19"/>
+                <w:numId w:val="16"/>
               </w:numPr>
               <w:bidi w:val="0"/>
               <w:spacing w:after="2" w:line="360" w:lineRule="auto"/>
@@ -16998,7 +16889,7 @@
               <w:widowControl w:val="0"/>
               <w:numPr>
                 <w:ilvl w:val="0"/>
-                <w:numId w:val="19"/>
+                <w:numId w:val="16"/>
               </w:numPr>
               <w:bidi w:val="0"/>
               <w:spacing w:after="2" w:line="360" w:lineRule="auto"/>
@@ -17180,7 +17071,7 @@
               <w:widowControl w:val="0"/>
               <w:numPr>
                 <w:ilvl w:val="0"/>
-                <w:numId w:val="19"/>
+                <w:numId w:val="16"/>
               </w:numPr>
               <w:bidi w:val="0"/>
               <w:spacing w:after="2" w:line="360" w:lineRule="auto"/>
@@ -17362,7 +17253,7 @@
               <w:widowControl w:val="0"/>
               <w:numPr>
                 <w:ilvl w:val="0"/>
-                <w:numId w:val="19"/>
+                <w:numId w:val="16"/>
               </w:numPr>
               <w:bidi w:val="0"/>
               <w:spacing w:after="2" w:line="360" w:lineRule="auto"/>
@@ -17544,7 +17435,7 @@
               <w:widowControl w:val="0"/>
               <w:numPr>
                 <w:ilvl w:val="0"/>
-                <w:numId w:val="19"/>
+                <w:numId w:val="16"/>
               </w:numPr>
               <w:bidi w:val="0"/>
               <w:spacing w:after="2" w:line="360" w:lineRule="auto"/>
@@ -17726,7 +17617,7 @@
               <w:widowControl w:val="0"/>
               <w:numPr>
                 <w:ilvl w:val="0"/>
-                <w:numId w:val="19"/>
+                <w:numId w:val="16"/>
               </w:numPr>
               <w:bidi w:val="0"/>
               <w:spacing w:after="2" w:line="360" w:lineRule="auto"/>
@@ -17908,7 +17799,7 @@
               <w:widowControl w:val="0"/>
               <w:numPr>
                 <w:ilvl w:val="0"/>
-                <w:numId w:val="19"/>
+                <w:numId w:val="16"/>
               </w:numPr>
               <w:bidi w:val="0"/>
               <w:spacing w:after="2" w:line="360" w:lineRule="auto"/>
@@ -18090,7 +17981,7 @@
               <w:widowControl w:val="0"/>
               <w:numPr>
                 <w:ilvl w:val="0"/>
-                <w:numId w:val="19"/>
+                <w:numId w:val="16"/>
               </w:numPr>
               <w:bidi w:val="0"/>
               <w:spacing w:after="2" w:line="360" w:lineRule="auto"/>
@@ -18272,7 +18163,7 @@
               <w:widowControl w:val="0"/>
               <w:numPr>
                 <w:ilvl w:val="0"/>
-                <w:numId w:val="19"/>
+                <w:numId w:val="16"/>
               </w:numPr>
               <w:bidi w:val="0"/>
               <w:spacing w:after="2" w:line="360" w:lineRule="auto"/>
@@ -18454,7 +18345,7 @@
               <w:widowControl w:val="0"/>
               <w:numPr>
                 <w:ilvl w:val="0"/>
-                <w:numId w:val="19"/>
+                <w:numId w:val="16"/>
               </w:numPr>
               <w:bidi w:val="0"/>
               <w:spacing w:after="2" w:line="360" w:lineRule="auto"/>
@@ -18630,8 +18521,8 @@
           <w:lang w:val="en-US" w:eastAsia="zh-CN"/>
         </w:rPr>
       </w:pPr>
-      <w:bookmarkStart w:id="42" w:name="_Toc13693"/>
-      <w:bookmarkStart w:id="43" w:name="_Toc3244"/>
+      <w:bookmarkStart w:id="39" w:name="_Toc13693"/>
+      <w:bookmarkStart w:id="40" w:name="_Toc3244"/>
       <w:r>
         <w:rPr>
           <w:rFonts w:hint="eastAsia" w:ascii="黑体" w:hAnsi="黑体" w:eastAsia="黑体" w:cs="黑体"/>
@@ -18641,8 +18532,8 @@
         </w:rPr>
         <w:t>售后服务及承诺</w:t>
       </w:r>
-      <w:bookmarkEnd w:id="42"/>
-      <w:bookmarkEnd w:id="43"/>
+      <w:bookmarkEnd w:id="39"/>
+      <w:bookmarkEnd w:id="40"/>
     </w:p>
     <w:p>
       <w:pPr>
@@ -18665,7 +18556,7 @@
           <w:lang w:val="en-US" w:eastAsia="zh-CN"/>
         </w:rPr>
       </w:pPr>
-      <w:bookmarkStart w:id="44" w:name="_Ref3359"/>
+      <w:bookmarkStart w:id="41" w:name="_Ref3359"/>
       <w:r>
         <w:rPr>
           <w:rFonts w:hint="eastAsia" w:eastAsia="黑体"/>
@@ -18675,7 +18566,7 @@
         </w:rPr>
         <w:t>【GEN:培训方案】</w:t>
       </w:r>
-      <w:bookmarkEnd w:id="44"/>
+      <w:bookmarkEnd w:id="41"/>
     </w:p>
     <w:p>
       <w:pPr>
@@ -18699,30 +18590,6 @@
           <w14:ligatures w14:val="none"/>
         </w:rPr>
         <w:t>【CONFIRM:质量保证期承诺】</w:t>
-      </w:r>
-      <w:r>
-        <w:rPr>
-          <w:rFonts w:hint="eastAsia" w:ascii="Times New Roman" w:hAnsi="Times New Roman" w:eastAsia="宋体" w:cs="Times New Roman"/>
-          <w:szCs w:val="18"/>
-          <w:lang w:val="en-US" w:eastAsia="zh-CN"/>
-          <w14:ligatures w14:val="none"/>
-        </w:rPr>
-      </w:r>
-      <w:r>
-        <w:rPr>
-          <w:rFonts w:hint="eastAsia" w:eastAsia="宋体" w:cs="Times New Roman"/>
-          <w:szCs w:val="18"/>
-          <w:lang w:val="en-US" w:eastAsia="zh-CN"/>
-          <w14:ligatures w14:val="none"/>
-        </w:rPr>
-      </w:r>
-      <w:r>
-        <w:rPr>
-          <w:rFonts w:hint="eastAsia" w:ascii="Times New Roman" w:hAnsi="Times New Roman" w:eastAsia="宋体" w:cs="Times New Roman"/>
-          <w:szCs w:val="18"/>
-          <w:lang w:val="en-US" w:eastAsia="zh-CN"/>
-          <w14:ligatures w14:val="none"/>
-        </w:rPr>
       </w:r>
     </w:p>
     <w:p>
@@ -18778,7 +18645,7 @@
         <w:widowControl/>
         <w:numPr>
           <w:ilvl w:val="0"/>
-          <w:numId w:val="20"/>
+          <w:numId w:val="17"/>
         </w:numPr>
         <w:spacing w:after="0" w:line="360" w:lineRule="auto"/>
         <w:ind w:left="845" w:leftChars="0" w:hanging="425" w:firstLineChars="0"/>
@@ -19221,26 +19088,6 @@
 <file path=word/numbering.xml><?xml version="1.0" encoding="utf-8"?>
 <w:numbering xmlns:wpc="http://schemas.microsoft.com/office/word/2010/wordprocessingCanvas" xmlns:mc="http://schemas.openxmlformats.org/markup-compatibility/2006" xmlns:o="urn:schemas-microsoft-com:office:office" xmlns:r="http://schemas.openxmlformats.org/officeDocument/2006/relationships" xmlns:m="http://schemas.openxmlformats.org/officeDocument/2006/math" xmlns:v="urn:schemas-microsoft-com:vml" xmlns:wp14="http://schemas.microsoft.com/office/word/2010/wordprocessingDrawing" xmlns:wp="http://schemas.openxmlformats.org/drawingml/2006/wordprocessingDrawing" xmlns:w10="urn:schemas-microsoft-com:office:word" xmlns:w="http://schemas.openxmlformats.org/wordprocessingml/2006/main" xmlns:w14="http://schemas.microsoft.com/office/word/2010/wordml" xmlns:wpg="http://schemas.microsoft.com/office/word/2010/wordprocessingGroup" xmlns:wpi="http://schemas.microsoft.com/office/word/2010/wordprocessingInk" xmlns:wne="http://schemas.microsoft.com/office/word/2006/wordml" xmlns:wps="http://schemas.microsoft.com/office/word/2010/wordprocessingShape" xmlns:wpsCustomData="http://www.wps.cn/officeDocument/2013/wpsCustomData" mc:Ignorable="w14 wp14">
   <w:abstractNum w:abstractNumId="0">
-    <w:nsid w:val="A1E71A1E"/>
-    <w:multiLevelType w:val="singleLevel"/>
-    <w:tmpl w:val="A1E71A1E"/>
-    <w:lvl w:ilvl="0" w:tentative="0">
-      <w:start w:val="1"/>
-      <w:numFmt w:val="decimal"/>
-      <w:lvlText w:val="%1."/>
-      <w:lvlJc w:val="left"/>
-      <w:pPr>
-        <w:tabs>
-          <w:tab w:val="left" w:pos="420"/>
-        </w:tabs>
-        <w:ind w:left="845" w:hanging="425"/>
-      </w:pPr>
-      <w:rPr>
-        <w:rFonts w:hint="default"/>
-      </w:rPr>
-    </w:lvl>
-  </w:abstractNum>
-  <w:abstractNum w:abstractNumId="1">
     <w:nsid w:val="A56C1EE8"/>
     <w:multiLevelType w:val="singleLevel"/>
     <w:tmpl w:val="A56C1EE8"/>
@@ -19258,7 +19105,7 @@
       </w:rPr>
     </w:lvl>
   </w:abstractNum>
-  <w:abstractNum w:abstractNumId="2">
+  <w:abstractNum w:abstractNumId="1">
     <w:nsid w:val="B7823A04"/>
     <w:multiLevelType w:val="singleLevel"/>
     <w:tmpl w:val="B7823A04"/>
@@ -19278,19 +19125,7 @@
       </w:rPr>
     </w:lvl>
   </w:abstractNum>
-  <w:abstractNum w:abstractNumId="3">
-    <w:nsid w:val="124CC255"/>
-    <w:multiLevelType w:val="singleLevel"/>
-    <w:tmpl w:val="124CC255"/>
-    <w:lvl w:ilvl="0" w:tentative="0">
-      <w:start w:val="1"/>
-      <w:numFmt w:val="decimal"/>
-      <w:suff w:val="nothing"/>
-      <w:lvlText w:val="（%1）"/>
-      <w:lvlJc w:val="left"/>
-    </w:lvl>
-  </w:abstractNum>
-  <w:abstractNum w:abstractNumId="4">
+  <w:abstractNum w:abstractNumId="2">
     <w:nsid w:val="1B6A587E"/>
     <w:multiLevelType w:val="multilevel"/>
     <w:tmpl w:val="1B6A587E"/>
@@ -19410,7 +19245,7 @@
       </w:pPr>
     </w:lvl>
   </w:abstractNum>
-  <w:abstractNum w:abstractNumId="5">
+  <w:abstractNum w:abstractNumId="3">
     <w:nsid w:val="1F0707B9"/>
     <w:multiLevelType w:val="multilevel"/>
     <w:tmpl w:val="1F0707B9"/>
@@ -19503,7 +19338,7 @@
       </w:pPr>
     </w:lvl>
   </w:abstractNum>
-  <w:abstractNum w:abstractNumId="6">
+  <w:abstractNum w:abstractNumId="4">
     <w:nsid w:val="23537A1C"/>
     <w:multiLevelType w:val="multilevel"/>
     <w:tmpl w:val="23537A1C"/>
@@ -19663,7 +19498,7 @@
       </w:rPr>
     </w:lvl>
   </w:abstractNum>
-  <w:abstractNum w:abstractNumId="7">
+  <w:abstractNum w:abstractNumId="5">
     <w:nsid w:val="496E4D7B"/>
     <w:multiLevelType w:val="multilevel"/>
     <w:tmpl w:val="496E4D7B"/>
@@ -19789,27 +19624,7 @@
       </w:pPr>
     </w:lvl>
   </w:abstractNum>
-  <w:abstractNum w:abstractNumId="8">
-    <w:nsid w:val="52737981"/>
-    <w:multiLevelType w:val="singleLevel"/>
-    <w:tmpl w:val="52737981"/>
-    <w:lvl w:ilvl="0" w:tentative="0">
-      <w:start w:val="1"/>
-      <w:numFmt w:val="decimal"/>
-      <w:lvlText w:val="(%1)"/>
-      <w:lvlJc w:val="left"/>
-      <w:pPr>
-        <w:tabs>
-          <w:tab w:val="left" w:pos="420"/>
-        </w:tabs>
-        <w:ind w:left="845" w:hanging="425"/>
-      </w:pPr>
-      <w:rPr>
-        <w:rFonts w:hint="default"/>
-      </w:rPr>
-    </w:lvl>
-  </w:abstractNum>
-  <w:abstractNum w:abstractNumId="9">
+  <w:abstractNum w:abstractNumId="6">
     <w:nsid w:val="557C2AF5"/>
     <w:multiLevelType w:val="multilevel"/>
     <w:tmpl w:val="557C2AF5"/>
@@ -19957,7 +19772,7 @@
       </w:rPr>
     </w:lvl>
   </w:abstractNum>
-  <w:abstractNum w:abstractNumId="10">
+  <w:abstractNum w:abstractNumId="7">
     <w:nsid w:val="59DDB0AE"/>
     <w:multiLevelType w:val="singleLevel"/>
     <w:tmpl w:val="59DDB0AE"/>
@@ -19977,7 +19792,7 @@
       </w:rPr>
     </w:lvl>
   </w:abstractNum>
-  <w:abstractNum w:abstractNumId="11">
+  <w:abstractNum w:abstractNumId="8">
     <w:nsid w:val="5D9C66AD"/>
     <w:multiLevelType w:val="multilevel"/>
     <w:tmpl w:val="5D9C66AD"/>
@@ -20097,7 +19912,7 @@
       </w:pPr>
     </w:lvl>
   </w:abstractNum>
-  <w:abstractNum w:abstractNumId="12">
+  <w:abstractNum w:abstractNumId="9">
     <w:nsid w:val="605607F0"/>
     <w:multiLevelType w:val="multilevel"/>
     <w:tmpl w:val="605607F0"/>
@@ -20187,7 +20002,7 @@
       </w:pPr>
     </w:lvl>
   </w:abstractNum>
-  <w:abstractNum w:abstractNumId="13">
+  <w:abstractNum w:abstractNumId="10">
     <w:nsid w:val="626A555D"/>
     <w:multiLevelType w:val="multilevel"/>
     <w:tmpl w:val="626A555D"/>
@@ -20313,7 +20128,7 @@
       </w:pPr>
     </w:lvl>
   </w:abstractNum>
-  <w:abstractNum w:abstractNumId="14">
+  <w:abstractNum w:abstractNumId="11">
     <w:nsid w:val="646260FA"/>
     <w:multiLevelType w:val="multilevel"/>
     <w:tmpl w:val="646260FA"/>
@@ -20455,7 +20270,7 @@
       </w:rPr>
     </w:lvl>
   </w:abstractNum>
-  <w:abstractNum w:abstractNumId="15">
+  <w:abstractNum w:abstractNumId="12">
     <w:nsid w:val="649A69AA"/>
     <w:multiLevelType w:val="multilevel"/>
     <w:tmpl w:val="649A69AA"/>
@@ -20574,7 +20389,7 @@
       </w:rPr>
     </w:lvl>
   </w:abstractNum>
-  <w:abstractNum w:abstractNumId="16">
+  <w:abstractNum w:abstractNumId="13">
     <w:nsid w:val="657D3FBC"/>
     <w:multiLevelType w:val="multilevel"/>
     <w:tmpl w:val="657D3FBC"/>
@@ -20732,7 +20547,7 @@
       </w:rPr>
     </w:lvl>
   </w:abstractNum>
-  <w:abstractNum w:abstractNumId="17">
+  <w:abstractNum w:abstractNumId="14">
     <w:nsid w:val="6CEA2025"/>
     <w:multiLevelType w:val="multilevel"/>
     <w:tmpl w:val="6CEA2025"/>
@@ -20885,7 +20700,7 @@
       </w:rPr>
     </w:lvl>
   </w:abstractNum>
-  <w:abstractNum w:abstractNumId="18">
+  <w:abstractNum w:abstractNumId="15">
     <w:nsid w:val="6DBF04F4"/>
     <w:multiLevelType w:val="multilevel"/>
     <w:tmpl w:val="6DBF04F4"/>
@@ -21011,7 +20826,7 @@
       </w:pPr>
     </w:lvl>
   </w:abstractNum>
-  <w:abstractNum w:abstractNumId="19">
+  <w:abstractNum w:abstractNumId="16">
     <w:nsid w:val="7D9871CD"/>
     <w:multiLevelType w:val="singleLevel"/>
     <w:tmpl w:val="7D9871CD"/>
@@ -21030,64 +20845,55 @@
     </w:lvl>
   </w:abstractNum>
   <w:num w:numId="1">
+    <w:abstractNumId w:val="2"/>
+  </w:num>
+  <w:num w:numId="2">
+    <w:abstractNumId w:val="8"/>
+  </w:num>
+  <w:num w:numId="3">
+    <w:abstractNumId w:val="13"/>
+  </w:num>
+  <w:num w:numId="4">
+    <w:abstractNumId w:val="14"/>
+  </w:num>
+  <w:num w:numId="5">
+    <w:abstractNumId w:val="10"/>
+  </w:num>
+  <w:num w:numId="6">
+    <w:abstractNumId w:val="11"/>
+  </w:num>
+  <w:num w:numId="7">
+    <w:abstractNumId w:val="6"/>
+  </w:num>
+  <w:num w:numId="8">
+    <w:abstractNumId w:val="15"/>
+  </w:num>
+  <w:num w:numId="9">
+    <w:abstractNumId w:val="5"/>
+  </w:num>
+  <w:num w:numId="10">
     <w:abstractNumId w:val="4"/>
   </w:num>
-  <w:num w:numId="2">
-    <w:abstractNumId w:val="11"/>
+  <w:num w:numId="11">
+    <w:abstractNumId w:val="12"/>
   </w:num>
-  <w:num w:numId="3">
+  <w:num w:numId="12">
+    <w:abstractNumId w:val="7"/>
+  </w:num>
+  <w:num w:numId="13">
+    <w:abstractNumId w:val="9"/>
+  </w:num>
+  <w:num w:numId="14">
+    <w:abstractNumId w:val="3"/>
+  </w:num>
+  <w:num w:numId="15">
+    <w:abstractNumId w:val="0"/>
+  </w:num>
+  <w:num w:numId="16">
     <w:abstractNumId w:val="16"/>
   </w:num>
-  <w:num w:numId="4">
-    <w:abstractNumId w:val="17"/>
-  </w:num>
-  <w:num w:numId="5">
-    <w:abstractNumId w:val="13"/>
-  </w:num>
-  <w:num w:numId="6">
-    <w:abstractNumId w:val="14"/>
-  </w:num>
-  <w:num w:numId="7">
-    <w:abstractNumId w:val="9"/>
-  </w:num>
-  <w:num w:numId="8">
-    <w:abstractNumId w:val="18"/>
-  </w:num>
-  <w:num w:numId="9">
-    <w:abstractNumId w:val="7"/>
-  </w:num>
-  <w:num w:numId="10">
-    <w:abstractNumId w:val="6"/>
-  </w:num>
-  <w:num w:numId="11">
-    <w:abstractNumId w:val="15"/>
-  </w:num>
-  <w:num w:numId="12">
-    <w:abstractNumId w:val="10"/>
-  </w:num>
-  <w:num w:numId="13">
-    <w:abstractNumId w:val="12"/>
-  </w:num>
-  <w:num w:numId="14">
-    <w:abstractNumId w:val="5"/>
-  </w:num>
-  <w:num w:numId="15">
+  <w:num w:numId="17">
     <w:abstractNumId w:val="1"/>
-  </w:num>
-  <w:num w:numId="16">
-    <w:abstractNumId w:val="0"/>
-  </w:num>
-  <w:num w:numId="17">
-    <w:abstractNumId w:val="3"/>
-  </w:num>
-  <w:num w:numId="18">
-    <w:abstractNumId w:val="8"/>
-  </w:num>
-  <w:num w:numId="19">
-    <w:abstractNumId w:val="19"/>
-  </w:num>
-  <w:num w:numId="20">
-    <w:abstractNumId w:val="2"/>
   </w:num>
 </w:numbering>
 </file>

</xml_diff>